<commit_message>
vault backup: 2026-10-18 15:30:40
</commit_message>
<xml_diff>
--- a/Visa/801 - Permanent Residency/Prepared Documents/Visa 801 Outstanding Items Report - WaKr-2631-801-3.docx
+++ b/Visa/801 - Permanent Residency/Prepared Documents/Visa 801 Outstanding Items Report - WaKr-2631-801-3.docx
@@ -96,7 +96,7 @@
           <w:rFonts w:ascii="Aptos" w:hAnsi="Aptos"/>
           <w:sz w:val="20"/>
         </w:rPr>
-        <w:t xml:space="preserve"> — complete using the previous form and attachment as the base, then review every answer for changes.</w:t>
+        <w:t xml:space="preserve"> — Kristina completed the supporting attachment and a reviewed Word/PDF version is in Drive. Confirm the remaining main-PDF facts, ask Affinity how to present the 2024–2026 study/volunteering period and subclass 820 visa-history row, obtain Affinity's review, then sign and date the final main form.</w:t>
       </w:r>
     </w:p>
     <w:p>
@@ -197,11 +197,10 @@
         <w:rPr>
           <w:rFonts w:ascii="Aptos" w:hAnsi="Aptos"/>
           <w:b/>
-          <w:color w:val="9C4800"/>
+          <w:color w:val="1A703D"/>
           <w:sz w:val="19"/>
-          <w:highlight w:val="yellow"/>
         </w:rPr>
-        <w:t xml:space="preserve">TO DO  </w:t>
+        <w:t xml:space="preserve">DONE  </w:t>
       </w:r>
       <w:r>
         <w:rPr>
@@ -216,7 +215,7 @@
           <w:rFonts w:ascii="Aptos" w:hAnsi="Aptos"/>
           <w:sz w:val="20"/>
         </w:rPr>
-        <w:t xml:space="preserve"> — locate correspondence addressed jointly, or separate correspondence addressed to Scott and Kristina at the same residential address.</w:t>
+        <w:t xml:space="preserve"> — none is known. Use the joint leases and separate same-address evidence instead.</w:t>
       </w:r>
     </w:p>
     <w:p>
@@ -395,17 +394,17 @@
         <w:rPr>
           <w:rFonts w:ascii="Aptos" w:hAnsi="Aptos"/>
           <w:b/>
-          <w:color w:val="9C4800"/>
+          <w:color w:val="1A703D"/>
           <w:sz w:val="19"/>
         </w:rPr>
-        <w:t xml:space="preserve">TO DO  </w:t>
+        <w:t xml:space="preserve">DONE  </w:t>
       </w:r>
       <w:r>
         <w:rPr>
           <w:rFonts w:ascii="Aptos" w:hAnsi="Aptos"/>
           <w:sz w:val="20"/>
         </w:rPr>
-        <w:t>Bali return-flight evidence for Kristina, if not yet received and filed.</w:t>
+        <w:t>Bali return-flight evidence — Jetstar JQ94 departed Denpasar on 10 October 2025 and arrived at the Gold Coast on 11 October 2025; the forwarded confirmation is filed in Drive.</w:t>
       </w:r>
     </w:p>
     <w:p>
@@ -671,17 +670,32 @@
         <w:rPr>
           <w:rFonts w:ascii="Aptos" w:hAnsi="Aptos"/>
           <w:b/>
-          <w:color w:val="9C4800"/>
+          <w:color w:val="1A703D"/>
           <w:sz w:val="19"/>
         </w:rPr>
-        <w:t xml:space="preserve">TO DO  </w:t>
+        <w:t xml:space="preserve">DONE  </w:t>
       </w:r>
       <w:r>
         <w:rPr>
           <w:rFonts w:ascii="Aptos" w:hAnsi="Aptos"/>
           <w:sz w:val="20"/>
         </w:rPr>
-        <w:t>Obtain Kristina's exact sanctuary role title from her contract or payslip if readily available.</w:t>
+        <w:t xml:space="preserve">Kristina confirmed the sanctuary role title as </w:t>
+      </w:r>
+      <w:r>
+        <w:rPr>
+          <w:rFonts w:ascii="Aptos" w:hAnsi="Aptos"/>
+          <w:b/>
+          <w:sz w:val="20"/>
+        </w:rPr>
+        <w:t>Animal Attendant</w:t>
+      </w:r>
+      <w:r>
+        <w:rPr>
+          <w:rFonts w:ascii="Aptos" w:hAnsi="Aptos"/>
+          <w:sz w:val="20"/>
+        </w:rPr>
+        <w:t xml:space="preserve"> and supplied the main duties in the Form 80 attachment.</w:t>
       </w:r>
     </w:p>
     <w:p>
@@ -764,11 +778,10 @@
         <w:rPr>
           <w:rFonts w:ascii="Aptos" w:hAnsi="Aptos"/>
           <w:b/>
-          <w:color w:val="9C4800"/>
+          <w:color w:val="1A703D"/>
           <w:sz w:val="19"/>
-          <w:highlight w:val="yellow"/>
         </w:rPr>
-        <w:t xml:space="preserve">TO DO  </w:t>
+        <w:t xml:space="preserve">DONE  </w:t>
       </w:r>
       <w:r>
         <w:rPr>
@@ -783,7 +796,7 @@
           <w:rFonts w:ascii="Aptos" w:hAnsi="Aptos"/>
           <w:sz w:val="20"/>
         </w:rPr>
-        <w:t xml:space="preserve"> Confirm that this is not applicable to the property.</w:t>
+        <w:t xml:space="preserve"> Not applicable to the property.</w:t>
       </w:r>
     </w:p>
     <w:p>
@@ -863,17 +876,17 @@
         <w:rPr>
           <w:rFonts w:ascii="Aptos" w:hAnsi="Aptos"/>
           <w:b/>
-          <w:color w:val="9C4800"/>
+          <w:color w:val="1A703D"/>
           <w:sz w:val="19"/>
         </w:rPr>
-        <w:t xml:space="preserve">TO DO  </w:t>
+        <w:t xml:space="preserve">DONE  </w:t>
       </w:r>
       <w:r>
         <w:rPr>
           <w:rFonts w:ascii="Aptos" w:hAnsi="Aptos"/>
           <w:sz w:val="20"/>
         </w:rPr>
-        <w:t>Add Kristina's Bali return evidence when received.</w:t>
+        <w:t>Kristina's Bali return evidence is filed; the flight departed Bali on 10 October and arrived in Australia on 11 October 2025.</w:t>
       </w:r>
     </w:p>
     <w:p>
@@ -1487,17 +1500,17 @@
         <w:rPr>
           <w:rFonts w:ascii="Aptos" w:hAnsi="Aptos"/>
           <w:b/>
-          <w:color w:val="9C4800"/>
+          <w:color w:val="1A703D"/>
           <w:sz w:val="19"/>
         </w:rPr>
-        <w:t xml:space="preserve">TO DO  </w:t>
+        <w:t xml:space="preserve">DONE  </w:t>
       </w:r>
       <w:r>
         <w:rPr>
           <w:rFonts w:ascii="Aptos" w:hAnsi="Aptos"/>
           <w:sz w:val="20"/>
         </w:rPr>
-        <w:t>Bulgaria accommodation information or additional travel photographs.</w:t>
+        <w:t>Bulgaria accommodation information or additional travel photographs are available.</w:t>
       </w:r>
     </w:p>
     <w:p>

</xml_diff>